<commit_message>
Pedagogy fixes from Dave's review pass
- Cheat sheet: Channel = F*L BUG fixed (output channels = F, always); L redefined
  as channels coming INTO the layer; worked answer table added (matches the notebook)
- Math deck: same L rewording (slides 4/5/8); param counts no longer written in
  shape notation (slide 15); 20K hook now concrete vs the ~407K M2 MNIST dense net
- Theory deck: slides 16-17 rewritten in course M/N/L/F notation (was quoted blog
  with conflicting l/k/n/m letters); bias-per-filter parallel drawn to dense layers
- Notebook mirror: where-is-the-bias demo cell (get_weights shapes)

Co-Authored-By: Claude Fable 5 <noreply@anthropic.com>
</commit_message>
<xml_diff>
--- a/OPIM5509_Module3_Files/slides/ConvNet Math Cheat Sheet.docx
+++ b/OPIM5509_Module3_Files/slides/ConvNet Math Cheat Sheet.docx
@@ -74,7 +74,7 @@
           <w:szCs w:val="24"/>
           <w:rtl w:val="0"/>
         </w:rPr>
-        <w:t xml:space="preserve">L - the number of channels (1 for black and white, 3 for color)</w:t>
+        <w:t>L - the number of channels coming INTO this layer (input image: 1 for black and white, 3 for color; deeper layers: the previous Conv2D's F)</w:t>
       </w:r>
     </w:p>
     <w:p>
@@ -287,7 +287,7 @@
           <w:szCs w:val="24"/>
           <w:rtl w:val="0"/>
         </w:rPr>
-        <w:t xml:space="preserve">Channel = F * L </w:t>
+        <w:t>Channel = F  # output channels ALWAYS equal the number of filters (NOT F*L - the L slices are summed inside each filter!)</w:t>
       </w:r>
       <w:r>
         <w:rPr>
@@ -610,6 +610,528 @@
         </w:rPr>
       </w:r>
     </w:p>
+    <w:p/>
+    <w:p>
+      <w:r>
+        <w:rPr>
+          <w:b/>
+        </w:rPr>
+        <w:t>Worked example - check yourself against Simple_Size_and_Param.ipynb (model 1, 28x28x1 input):</w:t>
+      </w:r>
+    </w:p>
+    <w:tbl>
+      <w:tblPr>
+        <w:tblW w:type="auto" w:w="0"/>
+        <w:tblLook w:firstColumn="1" w:firstRow="1" w:lastColumn="0" w:lastRow="0" w:noHBand="0" w:noVBand="1" w:val="04A0"/>
+        <w:tblBorders>
+          <w:top w:val="single" w:sz="4" w:color="666666"/>
+          <w:left w:val="single" w:sz="4" w:color="666666"/>
+          <w:bottom w:val="single" w:sz="4" w:color="666666"/>
+          <w:right w:val="single" w:sz="4" w:color="666666"/>
+          <w:insideH w:val="single" w:sz="4" w:color="666666"/>
+          <w:insideV w:val="single" w:sz="4" w:color="666666"/>
+        </w:tblBorders>
+      </w:tblPr>
+      <w:tblGrid>
+        <w:gridCol w:w="2340"/>
+        <w:gridCol w:w="2340"/>
+        <w:gridCol w:w="2340"/>
+        <w:gridCol w:w="2340"/>
+      </w:tblGrid>
+      <w:tr>
+        <w:tc>
+          <w:tcPr>
+            <w:tcW w:type="dxa" w:w="2340"/>
+          </w:tcPr>
+          <w:p>
+            <w:r>
+              <w:rPr>
+                <w:b/>
+                <w:sz w:val="18"/>
+              </w:rPr>
+              <w:t>Layer</w:t>
+            </w:r>
+          </w:p>
+        </w:tc>
+        <w:tc>
+          <w:tcPr>
+            <w:tcW w:type="dxa" w:w="2340"/>
+          </w:tcPr>
+          <w:p>
+            <w:r>
+              <w:rPr>
+                <w:b/>
+                <w:sz w:val="18"/>
+              </w:rPr>
+              <w:t>Output shape</w:t>
+            </w:r>
+          </w:p>
+        </w:tc>
+        <w:tc>
+          <w:tcPr>
+            <w:tcW w:type="dxa" w:w="2340"/>
+          </w:tcPr>
+          <w:p>
+            <w:r>
+              <w:rPr>
+                <w:b/>
+                <w:sz w:val="18"/>
+              </w:rPr>
+              <w:t>Trainable parms</w:t>
+            </w:r>
+          </w:p>
+        </w:tc>
+        <w:tc>
+          <w:tcPr>
+            <w:tcW w:type="dxa" w:w="2340"/>
+          </w:tcPr>
+          <w:p>
+            <w:r>
+              <w:rPr>
+                <w:b/>
+                <w:sz w:val="18"/>
+              </w:rPr>
+              <w:t>The math</w:t>
+            </w:r>
+          </w:p>
+        </w:tc>
+      </w:tr>
+      <w:tr>
+        <w:tc>
+          <w:tcPr>
+            <w:tcW w:type="dxa" w:w="2340"/>
+          </w:tcPr>
+          <w:p>
+            <w:r>
+              <w:rPr>
+                <w:sz w:val="18"/>
+              </w:rPr>
+              <w:t>Conv2D: F=3, filter (5,5)</w:t>
+            </w:r>
+          </w:p>
+        </w:tc>
+        <w:tc>
+          <w:tcPr>
+            <w:tcW w:type="dxa" w:w="2340"/>
+          </w:tcPr>
+          <w:p>
+            <w:r>
+              <w:rPr>
+                <w:sz w:val="18"/>
+              </w:rPr>
+              <w:t>(None, 24, 24, 3)</w:t>
+            </w:r>
+          </w:p>
+        </w:tc>
+        <w:tc>
+          <w:tcPr>
+            <w:tcW w:type="dxa" w:w="2340"/>
+          </w:tcPr>
+          <w:p>
+            <w:r>
+              <w:rPr>
+                <w:sz w:val="18"/>
+              </w:rPr>
+              <w:t>78</w:t>
+            </w:r>
+          </w:p>
+        </w:tc>
+        <w:tc>
+          <w:tcPr>
+            <w:tcW w:type="dxa" w:w="2340"/>
+          </w:tcPr>
+          <w:p>
+            <w:r>
+              <w:rPr>
+                <w:sz w:val="18"/>
+              </w:rPr>
+              <w:t>28-(5-1)=24; ((5*5*1)+1)*3</w:t>
+            </w:r>
+          </w:p>
+        </w:tc>
+      </w:tr>
+      <w:tr>
+        <w:tc>
+          <w:tcPr>
+            <w:tcW w:type="dxa" w:w="2340"/>
+          </w:tcPr>
+          <w:p>
+            <w:r>
+              <w:rPr>
+                <w:sz w:val="18"/>
+              </w:rPr>
+              <w:t>MaxPooling2D (2,2)</w:t>
+            </w:r>
+          </w:p>
+        </w:tc>
+        <w:tc>
+          <w:tcPr>
+            <w:tcW w:type="dxa" w:w="2340"/>
+          </w:tcPr>
+          <w:p>
+            <w:r>
+              <w:rPr>
+                <w:sz w:val="18"/>
+              </w:rPr>
+              <w:t>(None, 12, 12, 3)</w:t>
+            </w:r>
+          </w:p>
+        </w:tc>
+        <w:tc>
+          <w:tcPr>
+            <w:tcW w:type="dxa" w:w="2340"/>
+          </w:tcPr>
+          <w:p>
+            <w:r>
+              <w:rPr>
+                <w:sz w:val="18"/>
+              </w:rPr>
+              <w:t>0</w:t>
+            </w:r>
+          </w:p>
+        </w:tc>
+        <w:tc>
+          <w:tcPr>
+            <w:tcW w:type="dxa" w:w="2340"/>
+          </w:tcPr>
+          <w:p>
+            <w:r>
+              <w:rPr>
+                <w:sz w:val="18"/>
+              </w:rPr>
+              <w:t>24/2=12; nothing is learned</w:t>
+            </w:r>
+          </w:p>
+        </w:tc>
+      </w:tr>
+      <w:tr>
+        <w:tc>
+          <w:tcPr>
+            <w:tcW w:type="dxa" w:w="2340"/>
+          </w:tcPr>
+          <w:p>
+            <w:r>
+              <w:rPr>
+                <w:sz w:val="18"/>
+              </w:rPr>
+              <w:t>Conv2D: F=3, filter (3,3)</w:t>
+            </w:r>
+          </w:p>
+        </w:tc>
+        <w:tc>
+          <w:tcPr>
+            <w:tcW w:type="dxa" w:w="2340"/>
+          </w:tcPr>
+          <w:p>
+            <w:r>
+              <w:rPr>
+                <w:sz w:val="18"/>
+              </w:rPr>
+              <w:t>(None, 10, 10, 3)</w:t>
+            </w:r>
+          </w:p>
+        </w:tc>
+        <w:tc>
+          <w:tcPr>
+            <w:tcW w:type="dxa" w:w="2340"/>
+          </w:tcPr>
+          <w:p>
+            <w:r>
+              <w:rPr>
+                <w:sz w:val="18"/>
+              </w:rPr>
+              <w:t>84</w:t>
+            </w:r>
+          </w:p>
+        </w:tc>
+        <w:tc>
+          <w:tcPr>
+            <w:tcW w:type="dxa" w:w="2340"/>
+          </w:tcPr>
+          <w:p>
+            <w:r>
+              <w:rPr>
+                <w:sz w:val="18"/>
+              </w:rPr>
+              <w:t>12-(3-1)=10; ((3*3*3)+1)*3 - L=3 now!</w:t>
+            </w:r>
+          </w:p>
+        </w:tc>
+      </w:tr>
+      <w:tr>
+        <w:tc>
+          <w:tcPr>
+            <w:tcW w:type="dxa" w:w="2340"/>
+          </w:tcPr>
+          <w:p>
+            <w:r>
+              <w:rPr>
+                <w:sz w:val="18"/>
+              </w:rPr>
+              <w:t>MaxPooling2D (2,2)</w:t>
+            </w:r>
+          </w:p>
+        </w:tc>
+        <w:tc>
+          <w:tcPr>
+            <w:tcW w:type="dxa" w:w="2340"/>
+          </w:tcPr>
+          <w:p>
+            <w:r>
+              <w:rPr>
+                <w:sz w:val="18"/>
+              </w:rPr>
+              <w:t>(None, 5, 5, 3)</w:t>
+            </w:r>
+          </w:p>
+        </w:tc>
+        <w:tc>
+          <w:tcPr>
+            <w:tcW w:type="dxa" w:w="2340"/>
+          </w:tcPr>
+          <w:p>
+            <w:r>
+              <w:rPr>
+                <w:sz w:val="18"/>
+              </w:rPr>
+              <w:t>0</w:t>
+            </w:r>
+          </w:p>
+        </w:tc>
+        <w:tc>
+          <w:tcPr>
+            <w:tcW w:type="dxa" w:w="2340"/>
+          </w:tcPr>
+          <w:p>
+            <w:r>
+              <w:rPr>
+                <w:sz w:val="18"/>
+              </w:rPr>
+              <w:t>10/2=5</w:t>
+            </w:r>
+          </w:p>
+        </w:tc>
+      </w:tr>
+      <w:tr>
+        <w:tc>
+          <w:tcPr>
+            <w:tcW w:type="dxa" w:w="2340"/>
+          </w:tcPr>
+          <w:p>
+            <w:r>
+              <w:rPr>
+                <w:sz w:val="18"/>
+              </w:rPr>
+              <w:t>Flatten</w:t>
+            </w:r>
+          </w:p>
+        </w:tc>
+        <w:tc>
+          <w:tcPr>
+            <w:tcW w:type="dxa" w:w="2340"/>
+          </w:tcPr>
+          <w:p>
+            <w:r>
+              <w:rPr>
+                <w:sz w:val="18"/>
+              </w:rPr>
+              <w:t>(None, 75)</w:t>
+            </w:r>
+          </w:p>
+        </w:tc>
+        <w:tc>
+          <w:tcPr>
+            <w:tcW w:type="dxa" w:w="2340"/>
+          </w:tcPr>
+          <w:p>
+            <w:r>
+              <w:rPr>
+                <w:sz w:val="18"/>
+              </w:rPr>
+              <w:t>0</w:t>
+            </w:r>
+          </w:p>
+        </w:tc>
+        <w:tc>
+          <w:tcPr>
+            <w:tcW w:type="dxa" w:w="2340"/>
+          </w:tcPr>
+          <w:p>
+            <w:r>
+              <w:rPr>
+                <w:sz w:val="18"/>
+              </w:rPr>
+              <w:t>5*5*3=75</w:t>
+            </w:r>
+          </w:p>
+        </w:tc>
+      </w:tr>
+      <w:tr>
+        <w:tc>
+          <w:tcPr>
+            <w:tcW w:type="dxa" w:w="2340"/>
+          </w:tcPr>
+          <w:p>
+            <w:r>
+              <w:rPr>
+                <w:sz w:val="18"/>
+              </w:rPr>
+              <w:t>Dense(256)</w:t>
+            </w:r>
+          </w:p>
+        </w:tc>
+        <w:tc>
+          <w:tcPr>
+            <w:tcW w:type="dxa" w:w="2340"/>
+          </w:tcPr>
+          <w:p>
+            <w:r>
+              <w:rPr>
+                <w:sz w:val="18"/>
+              </w:rPr>
+              <w:t>(None, 256)</w:t>
+            </w:r>
+          </w:p>
+        </w:tc>
+        <w:tc>
+          <w:tcPr>
+            <w:tcW w:type="dxa" w:w="2340"/>
+          </w:tcPr>
+          <w:p>
+            <w:r>
+              <w:rPr>
+                <w:sz w:val="18"/>
+              </w:rPr>
+              <w:t>19,456</w:t>
+            </w:r>
+          </w:p>
+        </w:tc>
+        <w:tc>
+          <w:tcPr>
+            <w:tcW w:type="dxa" w:w="2340"/>
+          </w:tcPr>
+          <w:p>
+            <w:r>
+              <w:rPr>
+                <w:sz w:val="18"/>
+              </w:rPr>
+              <w:t>(75+1)*256</w:t>
+            </w:r>
+          </w:p>
+        </w:tc>
+      </w:tr>
+      <w:tr>
+        <w:tc>
+          <w:tcPr>
+            <w:tcW w:type="dxa" w:w="2340"/>
+          </w:tcPr>
+          <w:p>
+            <w:r>
+              <w:rPr>
+                <w:sz w:val="18"/>
+              </w:rPr>
+              <w:t>Dense(2, softmax)</w:t>
+            </w:r>
+          </w:p>
+        </w:tc>
+        <w:tc>
+          <w:tcPr>
+            <w:tcW w:type="dxa" w:w="2340"/>
+          </w:tcPr>
+          <w:p>
+            <w:r>
+              <w:rPr>
+                <w:sz w:val="18"/>
+              </w:rPr>
+              <w:t>(None, 2)</w:t>
+            </w:r>
+          </w:p>
+        </w:tc>
+        <w:tc>
+          <w:tcPr>
+            <w:tcW w:type="dxa" w:w="2340"/>
+          </w:tcPr>
+          <w:p>
+            <w:r>
+              <w:rPr>
+                <w:sz w:val="18"/>
+              </w:rPr>
+              <w:t>514</w:t>
+            </w:r>
+          </w:p>
+        </w:tc>
+        <w:tc>
+          <w:tcPr>
+            <w:tcW w:type="dxa" w:w="2340"/>
+          </w:tcPr>
+          <w:p>
+            <w:r>
+              <w:rPr>
+                <w:sz w:val="18"/>
+              </w:rPr>
+              <w:t>(256+1)*2</w:t>
+            </w:r>
+          </w:p>
+        </w:tc>
+      </w:tr>
+      <w:tr>
+        <w:tc>
+          <w:tcPr>
+            <w:tcW w:type="dxa" w:w="2340"/>
+          </w:tcPr>
+          <w:p>
+            <w:r>
+              <w:rPr>
+                <w:b/>
+                <w:sz w:val="18"/>
+              </w:rPr>
+              <w:t>TOTAL</w:t>
+            </w:r>
+          </w:p>
+        </w:tc>
+        <w:tc>
+          <w:tcPr>
+            <w:tcW w:type="dxa" w:w="2340"/>
+          </w:tcPr>
+          <w:p>
+            <w:r>
+              <w:rPr>
+                <w:b/>
+                <w:sz w:val="18"/>
+              </w:rPr>
+            </w:r>
+          </w:p>
+        </w:tc>
+        <w:tc>
+          <w:tcPr>
+            <w:tcW w:type="dxa" w:w="2340"/>
+          </w:tcPr>
+          <w:p>
+            <w:r>
+              <w:rPr>
+                <w:b/>
+                <w:sz w:val="18"/>
+              </w:rPr>
+              <w:t>20,132</w:t>
+            </w:r>
+          </w:p>
+        </w:tc>
+        <w:tc>
+          <w:tcPr>
+            <w:tcW w:type="dxa" w:w="2340"/>
+          </w:tcPr>
+          <w:p>
+            <w:r>
+              <w:rPr>
+                <w:b/>
+                <w:sz w:val="18"/>
+              </w:rPr>
+              <w:t>matches model.summary()!</w:t>
+            </w:r>
+          </w:p>
+        </w:tc>
+      </w:tr>
+    </w:tbl>
     <w:sectPr>
       <w:pgSz w:h="15840" w:w="12240" w:orient="portrait"/>
       <w:pgMar w:bottom="1440" w:top="1440" w:left="1440" w:right="1440" w:header="720" w:footer="720"/>

</xml_diff>

<commit_message>
Cheat sheet v2: 5 maps in second conv; L is inherited, F is chosen
Co-Authored-By: Claude Fable 5 <noreply@anthropic.com>
</commit_message>
<xml_diff>
--- a/OPIM5509_Module3_Files/slides/ConvNet Math Cheat Sheet.docx
+++ b/OPIM5509_Module3_Files/slides/ConvNet Math Cheat Sheet.docx
@@ -74,7 +74,7 @@
           <w:szCs w:val="24"/>
           <w:rtl w:val="0"/>
         </w:rPr>
-        <w:t>L - the number of channels coming INTO this layer (input image: 1 for black and white, 3 for color; deeper layers: the previous Conv2D's F)</w:t>
+        <w:t>L - the number of channels coming INTO this layer (input image: 1 for black and white, 3 for color; deeper layers: the previous Conv2D's F) L is INHERITED - the layer reads it off whatever arrives; you never choose it. (F is the one you choose.)</w:t>
       </w:r>
     </w:p>
     <w:p>
@@ -814,46 +814,46 @@
               <w:rPr>
                 <w:sz w:val="18"/>
               </w:rPr>
-              <w:t>Conv2D: F=3, filter (3,3)</w:t>
-            </w:r>
-          </w:p>
-        </w:tc>
-        <w:tc>
-          <w:tcPr>
-            <w:tcW w:type="dxa" w:w="2340"/>
-          </w:tcPr>
-          <w:p>
-            <w:r>
-              <w:rPr>
-                <w:sz w:val="18"/>
-              </w:rPr>
-              <w:t>(None, 10, 10, 3)</w:t>
-            </w:r>
-          </w:p>
-        </w:tc>
-        <w:tc>
-          <w:tcPr>
-            <w:tcW w:type="dxa" w:w="2340"/>
-          </w:tcPr>
-          <w:p>
-            <w:r>
-              <w:rPr>
-                <w:sz w:val="18"/>
-              </w:rPr>
-              <w:t>84</w:t>
-            </w:r>
-          </w:p>
-        </w:tc>
-        <w:tc>
-          <w:tcPr>
-            <w:tcW w:type="dxa" w:w="2340"/>
-          </w:tcPr>
-          <w:p>
-            <w:r>
-              <w:rPr>
-                <w:sz w:val="18"/>
-              </w:rPr>
-              <w:t>12-(3-1)=10; ((3*3*3)+1)*3 - L=3 now!</w:t>
+              <w:t>Conv2D: F=5, filter (3,3)</w:t>
+            </w:r>
+          </w:p>
+        </w:tc>
+        <w:tc>
+          <w:tcPr>
+            <w:tcW w:type="dxa" w:w="2340"/>
+          </w:tcPr>
+          <w:p>
+            <w:r>
+              <w:rPr>
+                <w:sz w:val="18"/>
+              </w:rPr>
+              <w:t>(None, 10, 10, 5)</w:t>
+            </w:r>
+          </w:p>
+        </w:tc>
+        <w:tc>
+          <w:tcPr>
+            <w:tcW w:type="dxa" w:w="2340"/>
+          </w:tcPr>
+          <w:p>
+            <w:r>
+              <w:rPr>
+                <w:sz w:val="18"/>
+              </w:rPr>
+              <w:t>140</w:t>
+            </w:r>
+          </w:p>
+        </w:tc>
+        <w:tc>
+          <w:tcPr>
+            <w:tcW w:type="dxa" w:w="2340"/>
+          </w:tcPr>
+          <w:p>
+            <w:r>
+              <w:rPr>
+                <w:sz w:val="18"/>
+              </w:rPr>
+              <w:t>12-(3-1)=10; ((3*3*3)+1)*5 - each filter is a 3x3x3 BLOCK: its depth 3 is inherited from the 3 maps coming in (you never type it); the 5 is how many blocks YOU chose</w:t>
             </w:r>
           </w:p>
         </w:tc>
@@ -881,7 +881,7 @@
               <w:rPr>
                 <w:sz w:val="18"/>
               </w:rPr>
-              <w:t>(None, 5, 5, 3)</w:t>
+              <w:t>(None, 5, 5, 5)</w:t>
             </w:r>
           </w:p>
         </w:tc>
@@ -935,7 +935,7 @@
               <w:rPr>
                 <w:sz w:val="18"/>
               </w:rPr>
-              <w:t>(None, 75)</w:t>
+              <w:t>(None, 125)</w:t>
             </w:r>
           </w:p>
         </w:tc>
@@ -961,7 +961,7 @@
               <w:rPr>
                 <w:sz w:val="18"/>
               </w:rPr>
-              <w:t>5*5*3=75</w:t>
+              <w:t>5*5*5=125</w:t>
             </w:r>
           </w:p>
         </w:tc>
@@ -1002,20 +1002,20 @@
               <w:rPr>
                 <w:sz w:val="18"/>
               </w:rPr>
-              <w:t>19,456</w:t>
-            </w:r>
-          </w:p>
-        </w:tc>
-        <w:tc>
-          <w:tcPr>
-            <w:tcW w:type="dxa" w:w="2340"/>
-          </w:tcPr>
-          <w:p>
-            <w:r>
-              <w:rPr>
-                <w:sz w:val="18"/>
-              </w:rPr>
-              <w:t>(75+1)*256</w:t>
+              <w:t>32,256</w:t>
+            </w:r>
+          </w:p>
+        </w:tc>
+        <w:tc>
+          <w:tcPr>
+            <w:tcW w:type="dxa" w:w="2340"/>
+          </w:tcPr>
+          <w:p>
+            <w:r>
+              <w:rPr>
+                <w:sz w:val="18"/>
+              </w:rPr>
+              <w:t>(125+1)*256</w:t>
             </w:r>
           </w:p>
         </w:tc>
@@ -1112,7 +1112,7 @@
                 <w:b/>
                 <w:sz w:val="18"/>
               </w:rPr>
-              <w:t>20,132</w:t>
+              <w:t>32,988</w:t>
             </w:r>
           </w:p>
         </w:tc>

</xml_diff>